<commit_message>
stage 3 complete: all 4 executor ops (set_style, find_replace, insert_toc, bold_span) verified end-to-end
</commit_message>
<xml_diff>
--- a/samples/sample_modified.docx
+++ b/samples/sample_modified.docx
@@ -3,6 +3,14 @@
 <w:document xmlns:wpc="http://schemas.microsoft.com/office/word/2010/wordprocessingCanvas" xmlns:cx="http://schemas.microsoft.com/office/drawing/2014/chartex" xmlns:cx1="http://schemas.microsoft.com/office/drawing/2015/9/8/chartex" xmlns:cx2="http://schemas.microsoft.com/office/drawing/2015/10/21/chartex" xmlns:cx3="http://schemas.microsoft.com/office/drawing/2016/5/9/chartex" xmlns:cx4="http://schemas.microsoft.com/office/drawing/2016/5/10/chartex" xmlns:cx5="http://schemas.microsoft.com/office/drawing/2016/5/11/chartex" xmlns:cx6="http://schemas.microsoft.com/office/drawing/2016/5/12/chartex" xmlns:cx7="http://schemas.microsoft.com/office/drawing/2016/5/13/chartex" xmlns:cx8="http://schemas.microsoft.com/office/drawing/2016/5/14/chartex" xmlns:mc="http://schemas.openxmlformats.org/markup-compatibility/2006" xmlns:aink="http://schemas.microsoft.com/office/drawing/2016/ink" xmlns:am3d="http://schemas.microsoft.com/office/drawing/2017/model3d" xmlns:o="urn:schemas-microsoft-com:office:office" xmlns:oel="http://schemas.microsoft.com/office/2019/extlst" xmlns:r="http://schemas.openxmlformats.org/officeDocument/2006/relationships" xmlns:m="http://schemas.openxmlformats.org/officeDocument/2006/math" xmlns:v="urn:schemas-microsoft-com:vml" xmlns:wp14="http://schemas.microsoft.com/office/word/2010/wordprocessingDrawing" xmlns:wp="http://schemas.openxmlformats.org/drawingml/2006/wordprocessingDrawing" xmlns:w10="urn:schemas-microsoft-com:office:word" xmlns:w="http://schemas.openxmlformats.org/wordprocessingml/2006/main" xmlns:w14="http://schemas.microsoft.com/office/word/2010/wordml" xmlns:w15="http://schemas.microsoft.com/office/word/2012/wordml" xmlns:w16cex="http://schemas.microsoft.com/office/word/2018/wordml/cex" xmlns:w16cid="http://schemas.microsoft.com/office/word/2016/wordml/cid" xmlns:w16="http://schemas.microsoft.com/office/word/2018/wordml" xmlns:w16du="http://schemas.microsoft.com/office/word/2023/wordml/word16du" xmlns:w16sdtdh="http://schemas.microsoft.com/office/word/2020/wordml/sdtdatahash" xmlns:w16sdtfl="http://schemas.microsoft.com/office/word/2024/wordml/sdtformatlock" xmlns:w16se="http://schemas.microsoft.com/office/word/2015/wordml/symex" xmlns:wpg="http://schemas.microsoft.com/office/word/2010/wordprocessingGroup" xmlns:wpi="http://schemas.microsoft.com/office/word/2010/wordprocessingInk" xmlns:wne="http://schemas.microsoft.com/office/word/2006/wordml" xmlns:wps="http://schemas.microsoft.com/office/word/2010/wordprocessingShape" mc:Ignorable="w14 w15 w16se w16cid w16 w16cex w16sdtdh w16sdtfl w16du wp14">
   <w:body>
     <w:p/>
+    <w:p>
+      <w:pPr>
+        <w:pStyle w:val="Heading1"/>
+      </w:pPr>
+      <w:r>
+        <w:t>Table of Contents (placeholder)</w:t>
+      </w:r>
+    </w:p>
     <w:p>
       <w:pPr>
         <w:pStyle w:val="Heading1"/>
@@ -46,7 +54,7 @@
         <w:rPr>
           <w:rFonts w:ascii="Arial Nova" w:hAnsi="Arial Nova"/>
         </w:rPr>
-        <w:t xml:space="preserve">Going paperless is one of the easiest ways to lower your carbon footprint. Instead of printing documents, utilize cloud-based collaboration tools. Additionally, organize and streamline your inbox by unsubscribing from unnecessary newsletters to reduce server energy consumption. </w:t>
+        <w:t xml:space="preserve">Going digital is one of the easiest ways to lower your carbon footprint. Instead of printing documents, utilize cloud-based collaboration tools. Additionally, organize and streamline your inbox by unsubscribing from unnecessary newsletters to reduce server energy consumption. </w:t>
       </w:r>
     </w:p>
     <w:p/>
@@ -69,21 +77,27 @@
         <w:rPr>
           <w:rFonts w:ascii="Arial Nova" w:hAnsi="Arial Nova"/>
         </w:rPr>
-        <w:t xml:space="preserve">Video calls can be surprisingly taxing on data </w:t>
       </w:r>
       <w:proofErr w:type="spellStart"/>
       <w:r>
         <w:rPr>
           <w:rFonts w:ascii="Arial Nova" w:hAnsi="Arial Nova"/>
         </w:rPr>
-        <w:t>centers</w:t>
       </w:r>
       <w:proofErr w:type="spellEnd"/>
       <w:r>
         <w:rPr>
           <w:rFonts w:ascii="Arial Nova" w:hAnsi="Arial Nova"/>
         </w:rPr>
-        <w:t xml:space="preserve"> and energy grids. Conserve bandwidth and lessen the environmental toll of your meetings by turning off your camera when it isn't strictly necessary, or by using lower resolution settings. </w:t>
+      </w:r>
+      <w:r>
+        <w:rPr>
+          <w:b/>
+        </w:rPr>
+        <w:t>Vide</w:t>
+      </w:r>
+      <w:r>
+        <w:t xml:space="preserve">o calls can be surprisingly taxing on data centers and energy grids. Conserve bandwidth and lessen the environmental toll of your meetings by turning off your camera when it isn't strictly necessary, or by using lower resolution settings. </w:t>
       </w:r>
     </w:p>
     <w:p/>

</xml_diff>